<commit_message>
tree adc no LIST mostra em tempo real as alocações de AA
</commit_message>
<xml_diff>
--- a/docs/Instrução de trabalho HC OVERVIEW.docx
+++ b/docs/Instrução de trabalho HC OVERVIEW.docx
@@ -124,7 +124,7 @@
                 <w:color w:val="FFFFFF"/>
                 <w:sz w:val="19"/>
               </w:rPr>
-              <w:t>00</w:t>
+              <w:t>01</w:t>
             </w:r>
           </w:p>
         </w:tc>
@@ -726,6 +726,11 @@
       </w:r>
     </w:p>
     <w:p>
+      <w:r>
+        <w:t>CNF2 e IXD_CNF2 são bases fisicamente separadas, mas o sistema permite empréstimo (LS) e transferência definitiva de colaboradores diretamente entre as duas pelo próprio Atualizar, sem exportar/importar planilha (ver seção 8.2.1).</w:t>
+      </w:r>
+    </w:p>
+    <w:p>
       <w:pPr>
         <w:pStyle w:val="Ttulo1"/>
       </w:pPr>
@@ -919,7 +924,7 @@
                 <w:sz w:val="19"/>
                 <w:lang w:val="pt-BR"/>
               </w:rPr>
-              <w:t>Função do colaborador. Valores aceitos: AA, Associado, PIT, Analista, Supervisor, Líder, Técnico, Fiscal, Coordenador, Gerente.</w:t>
+              <w:t>Função do colaborador. Valores aceitos no cadastro: Associado (AA é o mesmo cargo, consolidado), PA, PIT, PIT Trainee (rótulo de seleção para PIT recém-chegado em treinamento - grava e conta como PIT), Analista, Supervisor, Líder, Técnico, Fiscal, Coordenador, Gerente.</w:t>
             </w:r>
           </w:p>
         </w:tc>
@@ -1149,6 +1154,436 @@
                 <w:lang w:val="pt-BR"/>
               </w:rPr>
               <w:t>), usado na exportação e resetado automaticamente na virada de turno.</w:t>
+            </w:r>
+          </w:p>
+        </w:tc>
+      </w:tr>
+      <w:tr>
+        <w:tc>
+          <w:tcPr>
+            <w:tcW w:w="4873" w:type="dxa"/>
+            <w:vAlign w:val="center"/>
+          </w:tcPr>
+          <w:p>
+            <w:pPr>
+              <w:spacing w:after="0"/>
+            </w:pPr>
+            <w:r>
+              <w:rPr>
+                <w:rFonts w:ascii="Consolas" w:hAnsi="Consolas"/>
+                <w:sz w:val="19"/>
+              </w:rPr>
+              <w:t>LS</w:t>
+            </w:r>
+          </w:p>
+        </w:tc>
+        <w:tc>
+          <w:tcPr>
+            <w:tcW w:w="4873" w:type="dxa"/>
+            <w:vAlign w:val="center"/>
+          </w:tcPr>
+          <w:p>
+            <w:pPr>
+              <w:spacing w:after="0"/>
+              <w:rPr>
+                <w:lang w:val="pt-BR"/>
+              </w:rPr>
+            </w:pPr>
+            <w:proofErr w:type="spellStart"/>
+            <w:proofErr w:type="spellEnd"/>
+            <w:r>
+              <w:rPr>
+                <w:sz w:val="19"/>
+                <w:lang w:val="pt-BR"/>
+              </w:rPr>
+              <w:t>Labor Share - compartilhamento temporário de HC entre setores, inclusive entre CNF2 e IXD-CNF2.</w:t>
+            </w:r>
+          </w:p>
+        </w:tc>
+      </w:tr>
+      <w:tr>
+        <w:tc>
+          <w:tcPr>
+            <w:tcW w:w="4873" w:type="dxa"/>
+            <w:vAlign w:val="center"/>
+          </w:tcPr>
+          <w:p>
+            <w:pPr>
+              <w:spacing w:after="0"/>
+            </w:pPr>
+            <w:r>
+              <w:rPr>
+                <w:rFonts w:ascii="Consolas" w:hAnsi="Consolas"/>
+                <w:sz w:val="19"/>
+              </w:rPr>
+              <w:t>LT</w:t>
+            </w:r>
+          </w:p>
+        </w:tc>
+        <w:tc>
+          <w:tcPr>
+            <w:tcW w:w="4873" w:type="dxa"/>
+            <w:vAlign w:val="center"/>
+          </w:tcPr>
+          <w:p>
+            <w:pPr>
+              <w:spacing w:after="0"/>
+              <w:rPr>
+                <w:lang w:val="pt-BR"/>
+              </w:rPr>
+            </w:pPr>
+            <w:proofErr w:type="spellStart"/>
+            <w:proofErr w:type="spellEnd"/>
+            <w:r>
+              <w:rPr>
+                <w:sz w:val="19"/>
+                <w:lang w:val="pt-BR"/>
+              </w:rPr>
+              <w:t>Labor Transfer - transferência definitiva de HC entre setores.</w:t>
+            </w:r>
+          </w:p>
+        </w:tc>
+      </w:tr>
+      <w:tr>
+        <w:tc>
+          <w:tcPr>
+            <w:tcW w:w="4873" w:type="dxa"/>
+            <w:vAlign w:val="center"/>
+          </w:tcPr>
+          <w:p>
+            <w:pPr>
+              <w:spacing w:after="0"/>
+            </w:pPr>
+            <w:r>
+              <w:rPr>
+                <w:rFonts w:ascii="Consolas" w:hAnsi="Consolas"/>
+                <w:sz w:val="19"/>
+              </w:rPr>
+              <w:t>TOFF</w:t>
+            </w:r>
+          </w:p>
+        </w:tc>
+        <w:tc>
+          <w:tcPr>
+            <w:tcW w:w="4873" w:type="dxa"/>
+            <w:vAlign w:val="center"/>
+          </w:tcPr>
+          <w:p>
+            <w:pPr>
+              <w:spacing w:after="0"/>
+              <w:rPr>
+                <w:lang w:val="pt-BR"/>
+              </w:rPr>
+            </w:pPr>
+            <w:proofErr w:type="spellStart"/>
+            <w:proofErr w:type="spellEnd"/>
+            <w:r>
+              <w:rPr>
+                <w:sz w:val="19"/>
+                <w:lang w:val="pt-BR"/>
+              </w:rPr>
+              <w:t>Turn Off - redução de HC (desligamento programado via ticket de premissa).</w:t>
+            </w:r>
+          </w:p>
+        </w:tc>
+      </w:tr>
+      <w:tr>
+        <w:tc>
+          <w:tcPr>
+            <w:tcW w:w="4873" w:type="dxa"/>
+            <w:vAlign w:val="center"/>
+          </w:tcPr>
+          <w:p>
+            <w:pPr>
+              <w:spacing w:after="0"/>
+            </w:pPr>
+            <w:r>
+              <w:rPr>
+                <w:rFonts w:ascii="Consolas" w:hAnsi="Consolas"/>
+                <w:sz w:val="19"/>
+              </w:rPr>
+              <w:t>RP</w:t>
+            </w:r>
+          </w:p>
+        </w:tc>
+        <w:tc>
+          <w:tcPr>
+            <w:tcW w:w="4873" w:type="dxa"/>
+            <w:vAlign w:val="center"/>
+          </w:tcPr>
+          <w:p>
+            <w:pPr>
+              <w:spacing w:after="0"/>
+              <w:rPr>
+                <w:lang w:val="pt-BR"/>
+              </w:rPr>
+            </w:pPr>
+            <w:proofErr w:type="spellStart"/>
+            <w:proofErr w:type="spellEnd"/>
+            <w:r>
+              <w:rPr>
+                <w:sz w:val="19"/>
+                <w:lang w:val="pt-BR"/>
+              </w:rPr>
+              <w:t>Ramp Down - redução programada de capacidade.</w:t>
+            </w:r>
+          </w:p>
+        </w:tc>
+      </w:tr>
+      <w:tr>
+        <w:tc>
+          <w:tcPr>
+            <w:tcW w:w="4873" w:type="dxa"/>
+            <w:vAlign w:val="center"/>
+          </w:tcPr>
+          <w:p>
+            <w:pPr>
+              <w:spacing w:after="0"/>
+            </w:pPr>
+            <w:r>
+              <w:rPr>
+                <w:rFonts w:ascii="Consolas" w:hAnsi="Consolas"/>
+                <w:sz w:val="19"/>
+              </w:rPr>
+              <w:t>ON</w:t>
+            </w:r>
+          </w:p>
+        </w:tc>
+        <w:tc>
+          <w:tcPr>
+            <w:tcW w:w="4873" w:type="dxa"/>
+            <w:vAlign w:val="center"/>
+          </w:tcPr>
+          <w:p>
+            <w:pPr>
+              <w:spacing w:after="0"/>
+              <w:rPr>
+                <w:lang w:val="pt-BR"/>
+              </w:rPr>
+            </w:pPr>
+            <w:proofErr w:type="spellStart"/>
+            <w:proofErr w:type="spellEnd"/>
+            <w:r>
+              <w:rPr>
+                <w:sz w:val="19"/>
+                <w:lang w:val="pt-BR"/>
+              </w:rPr>
+              <w:t>New Hire - contratação de novo colaborador via ticket de premissa.</w:t>
+            </w:r>
+          </w:p>
+        </w:tc>
+      </w:tr>
+      <w:tr>
+        <w:tc>
+          <w:tcPr>
+            <w:tcW w:w="4873" w:type="dxa"/>
+            <w:vAlign w:val="center"/>
+          </w:tcPr>
+          <w:p>
+            <w:pPr>
+              <w:spacing w:after="0"/>
+            </w:pPr>
+            <w:r>
+              <w:rPr>
+                <w:rFonts w:ascii="Consolas" w:hAnsi="Consolas"/>
+                <w:sz w:val="19"/>
+              </w:rPr>
+              <w:t>VTO</w:t>
+            </w:r>
+          </w:p>
+        </w:tc>
+        <w:tc>
+          <w:tcPr>
+            <w:tcW w:w="4873" w:type="dxa"/>
+            <w:vAlign w:val="center"/>
+          </w:tcPr>
+          <w:p>
+            <w:pPr>
+              <w:spacing w:after="0"/>
+              <w:rPr>
+                <w:lang w:val="pt-BR"/>
+              </w:rPr>
+            </w:pPr>
+            <w:proofErr w:type="spellStart"/>
+            <w:proofErr w:type="spellEnd"/>
+            <w:r>
+              <w:rPr>
+                <w:sz w:val="19"/>
+                <w:lang w:val="pt-BR"/>
+              </w:rPr>
+              <w:t>Voluntary Time Off - ausência voluntária solicitada pelo colaborador via portal externo.</w:t>
+            </w:r>
+          </w:p>
+        </w:tc>
+      </w:tr>
+      <w:tr>
+        <w:tc>
+          <w:tcPr>
+            <w:tcW w:w="4873" w:type="dxa"/>
+            <w:vAlign w:val="center"/>
+          </w:tcPr>
+          <w:p>
+            <w:pPr>
+              <w:spacing w:after="0"/>
+            </w:pPr>
+            <w:r>
+              <w:rPr>
+                <w:rFonts w:ascii="Consolas" w:hAnsi="Consolas"/>
+                <w:sz w:val="19"/>
+              </w:rPr>
+              <w:t>VTE</w:t>
+            </w:r>
+          </w:p>
+        </w:tc>
+        <w:tc>
+          <w:tcPr>
+            <w:tcW w:w="4873" w:type="dxa"/>
+            <w:vAlign w:val="center"/>
+          </w:tcPr>
+          <w:p>
+            <w:pPr>
+              <w:spacing w:after="0"/>
+              <w:rPr>
+                <w:lang w:val="pt-BR"/>
+              </w:rPr>
+            </w:pPr>
+            <w:proofErr w:type="spellStart"/>
+            <w:proofErr w:type="spellEnd"/>
+            <w:r>
+              <w:rPr>
+                <w:sz w:val="19"/>
+                <w:lang w:val="pt-BR"/>
+              </w:rPr>
+              <w:t>Voluntary Time Extension - extensão voluntária de jornada em outro setor/turno, por 12 horas.</w:t>
+            </w:r>
+          </w:p>
+        </w:tc>
+      </w:tr>
+      <w:tr>
+        <w:tc>
+          <w:tcPr>
+            <w:tcW w:w="4873" w:type="dxa"/>
+            <w:vAlign w:val="center"/>
+          </w:tcPr>
+          <w:p>
+            <w:pPr>
+              <w:spacing w:after="0"/>
+            </w:pPr>
+            <w:r>
+              <w:rPr>
+                <w:rFonts w:ascii="Consolas" w:hAnsi="Consolas"/>
+                <w:sz w:val="19"/>
+              </w:rPr>
+              <w:t>DD</w:t>
+            </w:r>
+          </w:p>
+        </w:tc>
+        <w:tc>
+          <w:tcPr>
+            <w:tcW w:w="4873" w:type="dxa"/>
+            <w:vAlign w:val="center"/>
+          </w:tcPr>
+          <w:p>
+            <w:pPr>
+              <w:spacing w:after="0"/>
+              <w:rPr>
+                <w:lang w:val="pt-BR"/>
+              </w:rPr>
+            </w:pPr>
+            <w:proofErr w:type="spellStart"/>
+            <w:proofErr w:type="spellEnd"/>
+            <w:r>
+              <w:rPr>
+                <w:sz w:val="19"/>
+                <w:lang w:val="pt-BR"/>
+              </w:rPr>
+              <w:t>Due Diligence - relatório filtrado de movimentações, exportado em Excel a partir do Histórico.</w:t>
+            </w:r>
+          </w:p>
+        </w:tc>
+      </w:tr>
+      <w:tr>
+        <w:tc>
+          <w:tcPr>
+            <w:tcW w:w="4873" w:type="dxa"/>
+            <w:vAlign w:val="center"/>
+          </w:tcPr>
+          <w:p>
+            <w:pPr>
+              <w:spacing w:after="0"/>
+            </w:pPr>
+            <w:r>
+              <w:rPr>
+                <w:rFonts w:ascii="Consolas" w:hAnsi="Consolas"/>
+                <w:sz w:val="19"/>
+              </w:rPr>
+              <w:t>Agência</w:t>
+            </w:r>
+          </w:p>
+        </w:tc>
+        <w:tc>
+          <w:tcPr>
+            <w:tcW w:w="4873" w:type="dxa"/>
+            <w:vAlign w:val="center"/>
+          </w:tcPr>
+          <w:p>
+            <w:pPr>
+              <w:spacing w:after="0"/>
+              <w:rPr>
+                <w:lang w:val="pt-BR"/>
+              </w:rPr>
+            </w:pPr>
+            <w:proofErr w:type="spellStart"/>
+            <w:proofErr w:type="spellEnd"/>
+            <w:r>
+              <w:rPr>
+                <w:sz w:val="19"/>
+                <w:lang w:val="pt-BR"/>
+              </w:rPr>
+              <w:t>Agência de contratação do colaborador (AA/Associado/PA), cadastrada no HC e usada como filtro no LIST e no Dashboard.</w:t>
+            </w:r>
+          </w:p>
+        </w:tc>
+      </w:tr>
+      <w:tr>
+        <w:tc>
+          <w:tcPr>
+            <w:tcW w:w="4873" w:type="dxa"/>
+            <w:vAlign w:val="center"/>
+          </w:tcPr>
+          <w:p>
+            <w:pPr>
+              <w:spacing w:after="0"/>
+            </w:pPr>
+            <w:r>
+              <w:rPr>
+                <w:rFonts w:ascii="Consolas" w:hAnsi="Consolas"/>
+                <w:sz w:val="19"/>
+              </w:rPr>
+              <w:t>Chave de segurança (YubiKey)</w:t>
+            </w:r>
+          </w:p>
+        </w:tc>
+        <w:tc>
+          <w:tcPr>
+            <w:tcW w:w="4873" w:type="dxa"/>
+            <w:vAlign w:val="center"/>
+          </w:tcPr>
+          <w:p>
+            <w:pPr>
+              <w:spacing w:after="0"/>
+              <w:rPr>
+                <w:lang w:val="pt-BR"/>
+              </w:rPr>
+            </w:pPr>
+            <w:proofErr w:type="spellStart"/>
+            <w:proofErr w:type="spellEnd"/>
+            <w:r>
+              <w:rPr>
+                <w:sz w:val="19"/>
+                <w:lang w:val="pt-BR"/>
+              </w:rPr>
+              <w:t>Dispositivo físico de autenticação do usuário. Os 12 primeiros caracteres do código que ele “digita” são o ID público e estável daquela chave - usados para reconhecer o dono dela (ver seção 13.3).</w:t>
             </w:r>
           </w:p>
         </w:tc>
@@ -1392,7 +1827,7 @@
               <w:rPr>
                 <w:sz w:val="19"/>
               </w:rPr>
-              <w:t>EXPERT</w:t>
+              <w:t>LC-RH-ANALYTICS</w:t>
             </w:r>
           </w:p>
         </w:tc>
@@ -1404,16 +1839,94 @@
           <w:p>
             <w:pPr>
               <w:spacing w:after="0"/>
-              <w:rPr>
+            </w:pPr>
+            <w:proofErr w:type="spellStart"/>
+            <w:proofErr w:type="spellEnd"/>
+            <w:r>
+              <w:rPr>
+                <w:sz w:val="19"/>
                 <w:lang w:val="pt-BR"/>
               </w:rPr>
+              <w:t>Como o LC5, mas SEM Novo HC (cadastro) e SEM exclusão de colaborador - perfil de análise/RH que consulta e atualiza status.</w:t>
+            </w:r>
+          </w:p>
+        </w:tc>
+      </w:tr>
+      <w:tr>
+        <w:tc>
+          <w:tcPr>
+            <w:tcW w:w="4873" w:type="dxa"/>
+            <w:vAlign w:val="center"/>
+          </w:tcPr>
+          <w:p>
+            <w:pPr>
+              <w:spacing w:after="0"/>
             </w:pPr>
             <w:r>
               <w:rPr>
                 <w:sz w:val="19"/>
+              </w:rPr>
+              <w:t>EXPERT</w:t>
+            </w:r>
+          </w:p>
+        </w:tc>
+        <w:tc>
+          <w:tcPr>
+            <w:tcW w:w="4873" w:type="dxa"/>
+            <w:vAlign w:val="center"/>
+          </w:tcPr>
+          <w:p>
+            <w:pPr>
+              <w:spacing w:after="0"/>
+              <w:rPr>
                 <w:lang w:val="pt-BR"/>
               </w:rPr>
+            </w:pPr>
+            <w:r>
+              <w:rPr>
+                <w:sz w:val="19"/>
+                <w:lang w:val="pt-BR"/>
+              </w:rPr>
               <w:t>Acesso total (Admin): tudo dos níveis anteriores, mais Histórico e a tela Usuários (gestão de permissões e configuração de turnos).</w:t>
+            </w:r>
+          </w:p>
+        </w:tc>
+      </w:tr>
+      <w:tr>
+        <w:tc>
+          <w:tcPr>
+            <w:tcW w:w="4873" w:type="dxa"/>
+            <w:vAlign w:val="center"/>
+          </w:tcPr>
+          <w:p>
+            <w:pPr>
+              <w:spacing w:after="0"/>
+            </w:pPr>
+            <w:r>
+              <w:rPr>
+                <w:sz w:val="19"/>
+              </w:rPr>
+              <w:t>LC-HARD-EXPERT</w:t>
+            </w:r>
+          </w:p>
+        </w:tc>
+        <w:tc>
+          <w:tcPr>
+            <w:tcW w:w="4873" w:type="dxa"/>
+            <w:vAlign w:val="center"/>
+          </w:tcPr>
+          <w:p>
+            <w:pPr>
+              <w:spacing w:after="0"/>
+            </w:pPr>
+            <w:proofErr w:type="spellStart"/>
+            <w:proofErr w:type="spellEnd"/>
+            <w:r>
+              <w:rPr>
+                <w:sz w:val="19"/>
+                <w:lang w:val="pt-BR"/>
+              </w:rPr>
+              <w:t>Tudo do EXPERT, mais arquivar/cancelar tickets de premissa e programar desarquivamento automático (time de Planning). Só quem já recebeu EXPERT consegue ganhar este nível, e só um login específico autorizado concede ou remove LC-HARD-EXPERT de qualquer pessoa - nem o próprio EXPERT se autopromove.</w:t>
             </w:r>
           </w:p>
         </w:tc>
@@ -1466,7 +1979,7 @@
                 <w:sz w:val="19"/>
                 <w:lang w:val="pt-BR"/>
               </w:rPr>
-              <w:t>apenas um usuário EXPERT consegue liberar ou alterar o nível de outro operador, na tela Usuários (seção 13). Um EXPERT não consegue revogar o próprio acesso — evita que o sistema fique sem administrador.</w:t>
+              <w:t>apenas um usuário EXPERT consegue liberar ou alterar o nível de outro operador, na tela Usuários (seção 13). Um EXPERT não consegue revogar o próprio acesso — evita que o sistema fique sem administrador. LC-HARD-EXPERT segue regra à parte: só o login autorizado do time de Planning concede ou remove esse nível específico, mesmo que o operador logado já seja EXPERT.</w:t>
             </w:r>
           </w:p>
         </w:tc>
@@ -1629,6 +2142,11 @@
       </w:r>
     </w:p>
     <w:p>
+      <w:r>
+        <w:t>Após autenticar, a sessão permanece ativa por até 30 dias, inclusive fechando o navegador ou atualizando a página - não é mais necessário logar de novo a cada atualização, a menos que clique em Sair ou um administrador bloqueie o acesso. Usuários com uma chave de segurança (YubiKey) cadastrada por um EXPERT podem entrar por “Entrar com uma chave de segurança”, tocando a chave em vez de digitar o login (ver seção 13.3).</w:t>
+      </w:r>
+    </w:p>
+    <w:p>
       <w:pPr>
         <w:pStyle w:val="Ttulo1"/>
         <w:rPr>
@@ -1804,6 +2322,14 @@
           <w:lang w:val="pt-BR"/>
         </w:rPr>
         <w:t>Selecione Área e Turno, se já definidos.</w:t>
+      </w:r>
+    </w:p>
+    <w:p>
+      <w:pPr>
+        <w:pStyle w:val="Numerada"/>
+      </w:pPr>
+      <w:r>
+        <w:t>Preencha Agência, se aplicável (campo de texto livre, com sugestões das agências já cadastradas na unidade).</w:t>
       </w:r>
     </w:p>
     <w:p>
@@ -1860,7 +2386,7 @@
                 <w:sz w:val="19"/>
                 <w:lang w:val="pt-BR"/>
               </w:rPr>
-              <w:t>todo colaborador novo entra com status Treinamento, independente do que foi digitado. Se o cargo for PIT, o turno é automaticamente definido como ADM durante o treinamento, mesmo que outro turno tenha sido selecionado — o turno definitivo do PIT só é decidido depois, na virada para operacional (ver seção 14).</w:t>
+              <w:t>todo colaborador novo entra com status Treinamento, independente do que foi digitado. Se o cargo for PIT, o turno é automaticamente definido como ADM durante o treinamento, mesmo que outro turno tenha sido selecionado — o turno definitivo do PIT só é decidido depois, na virada para operacional (ver seção 14). O cargo PIT Trainee é apenas um rótulo de seleção para identificar um PIT recém-chegado em treinamento - o sistema grava e conta esse colaborador como PIT normalmente (aparece como “PIT Trainee” no LIST e no Dashboard enquanto a marcação estiver ativa).</w:t>
             </w:r>
           </w:p>
         </w:tc>
@@ -2062,8 +2588,7 @@
         <w:rPr>
           <w:lang w:val="pt-BR"/>
         </w:rPr>
-        <w:lastRenderedPageBreak/>
-        <w:t>No campo Status, escolha entre OPERACIONAL, Treinamento, Licença, Férias ou Desligado. Ao trocar, o formulário revela campos extras conforme a escolha.</w:t>
+        <w:t>No campo Status, escolha entre OPERACIONAL, LS (Labor Share), Treinamento, Ausência, Licença, Férias ou Desligado. VTE e VTO aparecem na lista mas ficam desabilitados para seleção manual - são aplicados automaticamente pelo sistema ao resolver um ticket RH (seção 11.3). Ao trocar o status, o formulário revela campos extras conforme a escolha.</w:t>
       </w:r>
     </w:p>
     <w:tbl>
@@ -2140,7 +2665,7 @@
               <w:rPr>
                 <w:sz w:val="19"/>
               </w:rPr>
-              <w:t>Licença / Férias</w:t>
+              <w:t>Ausência</w:t>
             </w:r>
           </w:p>
         </w:tc>
@@ -2153,40 +2678,16 @@
             <w:pPr>
               <w:spacing w:after="0"/>
             </w:pPr>
+            <w:proofErr w:type="spellStart"/>
+            <w:proofErr w:type="spellEnd"/>
+            <w:proofErr w:type="spellStart"/>
+            <w:proofErr w:type="spellEnd"/>
             <w:r>
               <w:rPr>
                 <w:sz w:val="19"/>
                 <w:lang w:val="pt-BR"/>
               </w:rPr>
-              <w:t xml:space="preserve">Data de início e data de fim (ou marcar "Sem data de início/fim" enquanto não houver previsão). </w:t>
-            </w:r>
-            <w:proofErr w:type="spellStart"/>
-            <w:r>
-              <w:rPr>
-                <w:sz w:val="19"/>
-              </w:rPr>
-              <w:t>Descrição</w:t>
-            </w:r>
-            <w:proofErr w:type="spellEnd"/>
-            <w:r>
-              <w:rPr>
-                <w:sz w:val="19"/>
-              </w:rPr>
-              <w:t xml:space="preserve"> </w:t>
-            </w:r>
-            <w:proofErr w:type="spellStart"/>
-            <w:r>
-              <w:rPr>
-                <w:sz w:val="19"/>
-              </w:rPr>
-              <w:t>obrigatória</w:t>
-            </w:r>
-            <w:proofErr w:type="spellEnd"/>
-            <w:r>
-              <w:rPr>
-                <w:sz w:val="19"/>
-              </w:rPr>
-              <w:t>.</w:t>
+              <w:t>Nenhum campo extra. Volta sozinho para OPERACIONAL na próxima troca de turno (seção 14) - não precisa esperar o dia seguinte.</w:t>
             </w:r>
           </w:p>
         </w:tc>
@@ -2205,7 +2706,7 @@
               <w:rPr>
                 <w:sz w:val="19"/>
               </w:rPr>
-              <w:t>Desligado</w:t>
+              <w:t>Licença / Férias</w:t>
             </w:r>
           </w:p>
         </w:tc>
@@ -2217,16 +2718,122 @@
           <w:p>
             <w:pPr>
               <w:spacing w:after="0"/>
-              <w:rPr>
+            </w:pPr>
+            <w:r>
+              <w:rPr>
+                <w:sz w:val="19"/>
                 <w:lang w:val="pt-BR"/>
               </w:rPr>
+              <w:t xml:space="preserve">Data de início e data de fim (ou marcar "Sem data de início/fim" enquanto não houver previsão). </w:t>
+            </w:r>
+            <w:proofErr w:type="spellStart"/>
+            <w:r>
+              <w:rPr>
+                <w:sz w:val="19"/>
+              </w:rPr>
+              <w:t>Descrição</w:t>
+            </w:r>
+            <w:proofErr w:type="spellEnd"/>
+            <w:r>
+              <w:rPr>
+                <w:sz w:val="19"/>
+              </w:rPr>
+              <w:t xml:space="preserve"> </w:t>
+            </w:r>
+            <w:proofErr w:type="spellStart"/>
+            <w:r>
+              <w:rPr>
+                <w:sz w:val="19"/>
+              </w:rPr>
+              <w:t>obrigatória</w:t>
+            </w:r>
+            <w:proofErr w:type="spellEnd"/>
+            <w:r>
+              <w:rPr>
+                <w:sz w:val="19"/>
+              </w:rPr>
+              <w:t>.</w:t>
+            </w:r>
+          </w:p>
+        </w:tc>
+      </w:tr>
+      <w:tr>
+        <w:tc>
+          <w:tcPr>
+            <w:tcW w:w="4873" w:type="dxa"/>
+            <w:vAlign w:val="center"/>
+          </w:tcPr>
+          <w:p>
+            <w:pPr>
+              <w:spacing w:after="0"/>
             </w:pPr>
             <w:r>
               <w:rPr>
                 <w:sz w:val="19"/>
+              </w:rPr>
+              <w:t>Desligado</w:t>
+            </w:r>
+          </w:p>
+        </w:tc>
+        <w:tc>
+          <w:tcPr>
+            <w:tcW w:w="4873" w:type="dxa"/>
+            <w:vAlign w:val="center"/>
+          </w:tcPr>
+          <w:p>
+            <w:pPr>
+              <w:spacing w:after="0"/>
+              <w:rPr>
                 <w:lang w:val="pt-BR"/>
               </w:rPr>
+            </w:pPr>
+            <w:r>
+              <w:rPr>
+                <w:sz w:val="19"/>
+                <w:lang w:val="pt-BR"/>
+              </w:rPr>
               <w:t>Data de desligamento e motivo obrigatório. Sem a data ainda, use o botão Pedir Data ao RH — envia e-mail automático para rh_gig2-br@id-logistics.com pedindo a previsão (ou abre um rascunho no cliente de e-mail, se o servidor não estiver configurado).</w:t>
+            </w:r>
+          </w:p>
+        </w:tc>
+      </w:tr>
+      <w:tr>
+        <w:tc>
+          <w:tcPr>
+            <w:tcW w:w="4873" w:type="dxa"/>
+            <w:vAlign w:val="center"/>
+          </w:tcPr>
+          <w:p>
+            <w:pPr>
+              <w:spacing w:after="0"/>
+            </w:pPr>
+            <w:r>
+              <w:rPr>
+                <w:sz w:val="19"/>
+              </w:rPr>
+              <w:t>LS — Labor Share</w:t>
+            </w:r>
+          </w:p>
+        </w:tc>
+        <w:tc>
+          <w:tcPr>
+            <w:tcW w:w="4873" w:type="dxa"/>
+            <w:vAlign w:val="center"/>
+          </w:tcPr>
+          <w:p>
+            <w:pPr>
+              <w:spacing w:after="0"/>
+            </w:pPr>
+            <w:proofErr w:type="spellStart"/>
+            <w:proofErr w:type="spellEnd"/>
+            <w:proofErr w:type="spellStart"/>
+            <w:proofErr w:type="spellEnd"/>
+            <w:r>
+              <w:rPr>
+                <w:sz w:val="19"/>
+                <w:lang w:val="pt-BR"/>
+              </w:rPr>
+              <w:t>Setor de destino e data de retorno (obrigatórios). Se o site tiver um parceiro de troca (CNF2 ⇄ IXD-CNF2), aparece também o tipo de empréstimo - ver seção 8.2.1.</w:t>
             </w:r>
           </w:p>
         </w:tc>
@@ -2253,6 +2860,84 @@
         <w:t>Finalize clicando em Salvar alteração. Fechar descarta a edição.</w:t>
       </w:r>
     </w:p>
+    <w:p>
+      <w:pPr>
+        <w:pStyle w:val="Ttulo2"/>
+      </w:pPr>
+      <w:r>
+        <w:t>8.2.1 · Empréstimo entre sites (LS cruzado CNF2 ⇄ IXD-CNF2)</w:t>
+      </w:r>
+    </w:p>
+    <w:p>
+      <w:r>
+        <w:t>Disponível apenas quando o status escolhido é LS e a unidade atual tem um parceiro de troca cadastrado (hoje, CNF2 e IXD_CNF2 um do outro). O campo Tipo de empréstimo passa a oferecer três opções:</w:t>
+      </w:r>
+    </w:p>
+    <w:p>
+      <w:pPr>
+        <w:pStyle w:val="Commarcadores"/>
+      </w:pPr>
+      <w:r>
+        <w:t>Dentro do site atual - comportamento normal do LS, sem mudar de base de dados.</w:t>
+      </w:r>
+    </w:p>
+    <w:p>
+      <w:pPr>
+        <w:pStyle w:val="Commarcadores"/>
+      </w:pPr>
+      <w:r>
+        <w:t>Emprestar para [site parceiro] - o colaborador migra para o banco de dados do site parceiro enquanto durar o empréstimo e volta sozinho (setor e escala de origem) na data de retorno marcada, na próxima troca de turno (mesma regra do LS normal).</w:t>
+      </w:r>
+    </w:p>
+    <w:p>
+      <w:pPr>
+        <w:pStyle w:val="Commarcadores"/>
+      </w:pPr>
+      <w:r>
+        <w:t>Transferência definitiva para [site parceiro] - move o cadastro de vez para o banco do site parceiro. Ele deixa de existir na unidade atual e é recriado lá sem setor definido, aparecendo em Pendências até alguém preencher a área. Não pode ser desfeita por aqui.</w:t>
+      </w:r>
+    </w:p>
+    <w:tbl>
+      <w:tblPr>
+        <w:tblW w:type="auto" w:w="0"/>
+        <w:tblLook w:firstColumn="1" w:firstRow="1" w:lastColumn="0" w:lastRow="0" w:noHBand="0" w:noVBand="1" w:val="04A0"/>
+      </w:tblPr>
+      <w:tblGrid>
+        <w:gridCol w:w="9746"/>
+      </w:tblGrid>
+      <w:tr>
+        <w:tc>
+          <w:tcPr>
+            <w:tcW w:type="dxa" w:w="9746"/>
+            <w:tcW w:w="9746" w:type="dxa"/>
+            <w:tcBorders>
+              <w:left w:val="single" w:sz="24" w:space="0" w:color="8A5C05"/>
+            </w:tcBorders>
+            <w:shd w:val="clear" w:color="auto" w:fill="F8ECD6"/>
+          </w:tcPr>
+          <w:p>
+            <w:pPr>
+              <w:spacing w:after="40"/>
+            </w:pPr>
+            <w:r>
+              <w:rPr>
+                <w:b/>
+                <w:color w:val="6E4A04"/>
+                <w:sz w:val="19"/>
+              </w:rPr>
+              <w:t xml:space="preserve">Importante: </w:t>
+            </w:r>
+            <w:r>
+              <w:rPr>
+                <w:color w:val="3B4854"/>
+                <w:sz w:val="19"/>
+              </w:rPr>
+              <w:t>o empréstimo/transferência entre sites usa bases de dados fisicamente separadas - a movimentação só é possível pelos botões do próprio Atualizar, nunca por importação de CSV.</w:t>
+            </w:r>
+          </w:p>
+        </w:tc>
+      </w:tr>
+    </w:tbl>
     <w:p>
       <w:pPr>
         <w:pStyle w:val="Ttulo2"/>
@@ -2395,7 +3080,7 @@
                 <w:sz w:val="19"/>
                 <w:lang w:val="pt-BR"/>
               </w:rPr>
-              <w:t>Baixa hc_gig2.xlsx com todos os colaboradores e seus campos.</w:t>
+              <w:t>Baixa hc_gig2.xlsx com todos os colaboradores e seus campos, incluindo a Agência (quando preenchida).</w:t>
             </w:r>
           </w:p>
         </w:tc>
@@ -2745,7 +3430,7 @@
         <w:rPr>
           <w:lang w:val="pt-BR"/>
         </w:rPr>
-        <w:t>A barra Filtros tem quatro grupos — Área, Turno, Status, Cargo — todos aplicados juntos sobre cards, gráficos e o bloco de LC ao mesmo tempo.</w:t>
+        <w:t>A barra Filtros tem cinco grupos - Área, Turno, Status, Cargo, Agência - todos aplicados juntos sobre cards, gráficos e o bloco de LC ao mesmo tempo.</w:t>
       </w:r>
     </w:p>
     <w:p>
@@ -3057,6 +3742,14 @@
     </w:p>
     <w:p>
       <w:pPr>
+        <w:pStyle w:val="Ttulo2"/>
+      </w:pPr>
+      <w:r>
+        <w:t>11.1 · Pendências cadastrais</w:t>
+      </w:r>
+    </w:p>
+    <w:p>
+      <w:pPr>
         <w:rPr>
           <w:lang w:val="pt-BR"/>
         </w:rPr>
@@ -3200,94 +3893,696 @@
     </w:tbl>
     <w:p>
       <w:pPr>
-        <w:spacing w:after="40"/>
-        <w:rPr>
-          <w:lang w:val="pt-BR"/>
-        </w:rPr>
-      </w:pPr>
+        <w:pStyle w:val="Ttulo2"/>
+      </w:pPr>
+      <w:r>
+        <w:t>11.2 · Tickets de premissas (LS · LT · TOFF · RP · ON)</w:t>
+      </w:r>
     </w:p>
     <w:p>
-      <w:pPr>
-        <w:pStyle w:val="Ttulo1"/>
-        <w:rPr>
-          <w:lang w:val="pt-BR"/>
-        </w:rPr>
-      </w:pPr>
-      <w:r>
-        <w:rPr>
-          <w:lang w:val="pt-BR"/>
-        </w:rPr>
-        <w:t>12. Histórico</w:t>
+      <w:r>
+        <w:t>Tickets gerados pela ferramenta de planejamento de premissas (Ariel LA Planning / gig2_hc_premises) - a HC Overview só grava o resultado da ação (colunas hcview_*), nunca cria ou altera o ticket em si:</w:t>
+      </w:r>
+    </w:p>
+    <w:tbl>
+      <w:tblPr>
+        <w:tblStyle w:val="Tabelacomgrade"/>
+        <w:tblW w:type="auto" w:w="0"/>
+        <w:tblLook w:firstColumn="1" w:firstRow="1" w:lastColumn="0" w:lastRow="0" w:noHBand="0" w:noVBand="1" w:val="04A0"/>
+      </w:tblPr>
+      <w:tblGrid>
+        <w:gridCol w:w="3249"/>
+        <w:gridCol w:w="3249"/>
+        <w:gridCol w:w="3249"/>
+      </w:tblGrid>
+      <w:tr>
+        <w:tc>
+          <w:tcPr>
+            <w:tcW w:type="dxa" w:w="3249"/>
+            <w:shd w:val="clear" w:color="auto" w:fill="F4F6F7"/>
+          </w:tcPr>
+          <w:p>
+            <w:r>
+              <w:rPr>
+                <w:b/>
+                <w:sz w:val="18"/>
+              </w:rPr>
+              <w:t>Tipo</w:t>
+            </w:r>
+          </w:p>
+        </w:tc>
+        <w:tc>
+          <w:tcPr>
+            <w:tcW w:type="dxa" w:w="3249"/>
+            <w:shd w:val="clear" w:color="auto" w:fill="F4F6F7"/>
+          </w:tcPr>
+          <w:p>
+            <w:r>
+              <w:rPr>
+                <w:b/>
+                <w:sz w:val="18"/>
+              </w:rPr>
+              <w:t>Descrição</w:t>
+            </w:r>
+          </w:p>
+        </w:tc>
+        <w:tc>
+          <w:tcPr>
+            <w:tcW w:type="dxa" w:w="3249"/>
+            <w:shd w:val="clear" w:color="auto" w:fill="F4F6F7"/>
+          </w:tcPr>
+          <w:p>
+            <w:r>
+              <w:rPr>
+                <w:b/>
+                <w:sz w:val="18"/>
+              </w:rPr>
+              <w:t>Quem resolve</w:t>
+            </w:r>
+          </w:p>
+        </w:tc>
+      </w:tr>
+      <w:tr>
+        <w:tc>
+          <w:tcPr>
+            <w:tcW w:type="dxa" w:w="3249"/>
+            <w:vAlign w:val="center"/>
+          </w:tcPr>
+          <w:p>
+            <w:r>
+              <w:rPr>
+                <w:sz w:val="19"/>
+              </w:rPr>
+              <w:t>LS (Labor Share)</w:t>
+            </w:r>
+          </w:p>
+        </w:tc>
+        <w:tc>
+          <w:tcPr>
+            <w:tcW w:type="dxa" w:w="3249"/>
+            <w:vAlign w:val="center"/>
+          </w:tcPr>
+          <w:p>
+            <w:r>
+              <w:rPr>
+                <w:sz w:val="19"/>
+              </w:rPr>
+              <w:t>Compartilhamento de HC entre setores (ou entre CNF2 e IXD-CNF2 - seção 8.2.1).</w:t>
+            </w:r>
+          </w:p>
+        </w:tc>
+        <w:tc>
+          <w:tcPr>
+            <w:tcW w:type="dxa" w:w="3249"/>
+            <w:vAlign w:val="center"/>
+          </w:tcPr>
+          <w:p>
+            <w:r>
+              <w:rPr>
+                <w:sz w:val="19"/>
+              </w:rPr>
+              <w:t>RME do setor de origem</w:t>
+            </w:r>
+          </w:p>
+        </w:tc>
+      </w:tr>
+      <w:tr>
+        <w:tc>
+          <w:tcPr>
+            <w:tcW w:type="dxa" w:w="3249"/>
+            <w:vAlign w:val="center"/>
+          </w:tcPr>
+          <w:p>
+            <w:r>
+              <w:rPr>
+                <w:sz w:val="19"/>
+              </w:rPr>
+              <w:t>LT (Labor Transfer)</w:t>
+            </w:r>
+          </w:p>
+        </w:tc>
+        <w:tc>
+          <w:tcPr>
+            <w:tcW w:type="dxa" w:w="3249"/>
+            <w:vAlign w:val="center"/>
+          </w:tcPr>
+          <w:p>
+            <w:r>
+              <w:rPr>
+                <w:sz w:val="19"/>
+              </w:rPr>
+              <w:t>Transferência definitiva de HC.</w:t>
+            </w:r>
+          </w:p>
+        </w:tc>
+        <w:tc>
+          <w:tcPr>
+            <w:tcW w:type="dxa" w:w="3249"/>
+            <w:vAlign w:val="center"/>
+          </w:tcPr>
+          <w:p>
+            <w:r>
+              <w:rPr>
+                <w:sz w:val="19"/>
+              </w:rPr>
+              <w:t>RME do setor de origem</w:t>
+            </w:r>
+          </w:p>
+        </w:tc>
+      </w:tr>
+      <w:tr>
+        <w:tc>
+          <w:tcPr>
+            <w:tcW w:type="dxa" w:w="3249"/>
+            <w:vAlign w:val="center"/>
+          </w:tcPr>
+          <w:p>
+            <w:r>
+              <w:rPr>
+                <w:sz w:val="19"/>
+              </w:rPr>
+              <w:t>TOFF (Turn Off)</w:t>
+            </w:r>
+          </w:p>
+        </w:tc>
+        <w:tc>
+          <w:tcPr>
+            <w:tcW w:type="dxa" w:w="3249"/>
+            <w:vAlign w:val="center"/>
+          </w:tcPr>
+          <w:p>
+            <w:r>
+              <w:rPr>
+                <w:sz w:val="19"/>
+              </w:rPr>
+              <w:t>Redução de HC (desligamento programado).</w:t>
+            </w:r>
+          </w:p>
+        </w:tc>
+        <w:tc>
+          <w:tcPr>
+            <w:tcW w:type="dxa" w:w="3249"/>
+            <w:vAlign w:val="center"/>
+          </w:tcPr>
+          <w:p>
+            <w:r>
+              <w:rPr>
+                <w:sz w:val="19"/>
+              </w:rPr>
+              <w:t>RME do setor</w:t>
+            </w:r>
+          </w:p>
+        </w:tc>
+      </w:tr>
+      <w:tr>
+        <w:tc>
+          <w:tcPr>
+            <w:tcW w:type="dxa" w:w="3249"/>
+            <w:vAlign w:val="center"/>
+          </w:tcPr>
+          <w:p>
+            <w:r>
+              <w:rPr>
+                <w:sz w:val="19"/>
+              </w:rPr>
+              <w:t>RP (Ramp Down)</w:t>
+            </w:r>
+          </w:p>
+        </w:tc>
+        <w:tc>
+          <w:tcPr>
+            <w:tcW w:type="dxa" w:w="3249"/>
+            <w:vAlign w:val="center"/>
+          </w:tcPr>
+          <w:p>
+            <w:r>
+              <w:rPr>
+                <w:sz w:val="19"/>
+              </w:rPr>
+              <w:t>Redução programada de capacidade.</w:t>
+            </w:r>
+          </w:p>
+        </w:tc>
+        <w:tc>
+          <w:tcPr>
+            <w:tcW w:type="dxa" w:w="3249"/>
+            <w:vAlign w:val="center"/>
+          </w:tcPr>
+          <w:p>
+            <w:r>
+              <w:rPr>
+                <w:sz w:val="19"/>
+              </w:rPr>
+              <w:t>RME do setor</w:t>
+            </w:r>
+          </w:p>
+        </w:tc>
+      </w:tr>
+      <w:tr>
+        <w:tc>
+          <w:tcPr>
+            <w:tcW w:type="dxa" w:w="3249"/>
+            <w:vAlign w:val="center"/>
+          </w:tcPr>
+          <w:p>
+            <w:r>
+              <w:rPr>
+                <w:sz w:val="19"/>
+              </w:rPr>
+              <w:t>ON (New Hire)</w:t>
+            </w:r>
+          </w:p>
+        </w:tc>
+        <w:tc>
+          <w:tcPr>
+            <w:tcW w:type="dxa" w:w="3249"/>
+            <w:vAlign w:val="center"/>
+          </w:tcPr>
+          <w:p>
+            <w:r>
+              <w:rPr>
+                <w:sz w:val="19"/>
+              </w:rPr>
+              <w:t>Contratação de novo HC.</w:t>
+            </w:r>
+          </w:p>
+        </w:tc>
+        <w:tc>
+          <w:tcPr>
+            <w:tcW w:type="dxa" w:w="3249"/>
+            <w:vAlign w:val="center"/>
+          </w:tcPr>
+          <w:p>
+            <w:r>
+              <w:rPr>
+                <w:sz w:val="19"/>
+              </w:rPr>
+              <w:t>EXPERT</w:t>
+            </w:r>
+          </w:p>
+        </w:tc>
+      </w:tr>
+    </w:tbl>
+    <w:p>
+      <w:r>
+        <w:t>Prazo: LS e LT vencem na própria data solicitada (work_date), no horário configurado para o shift de destino (Usuários → Configuração de Shifts) - só depois desse horário ficam “Não conforme”. Os demais tipos mantêm a antecedência de 3 dias. No LS, os colaboradores validados ficam com retorno automático agendado, recuperando o setor e a escala de origem na próxima troca de turno (mesma lógica da seção 14).</w:t>
       </w:r>
     </w:p>
     <w:p>
-      <w:pPr>
-        <w:rPr>
-          <w:lang w:val="pt-BR"/>
-        </w:rPr>
-      </w:pPr>
-      <w:r>
-        <w:rPr>
-          <w:lang w:val="pt-BR"/>
-        </w:rPr>
-        <w:t>Tela: Histórico · Nível mínimo: EXPERT</w:t>
+      <w:r>
+        <w:t>Como resolver:</w:t>
       </w:r>
     </w:p>
     <w:p>
       <w:pPr>
-        <w:rPr>
-          <w:lang w:val="pt-BR"/>
-        </w:rPr>
-      </w:pPr>
-      <w:r>
-        <w:rPr>
-          <w:lang w:val="pt-BR"/>
-        </w:rPr>
-        <w:t>Duas abas:</w:t>
+        <w:pStyle w:val="Numerada"/>
+      </w:pPr>
+      <w:r>
+        <w:t>Clique em Resolver Pendência → vai direto para o Atualizar filtrado pelo turno/setor do responsável.</w:t>
       </w:r>
     </w:p>
     <w:p>
       <w:pPr>
-        <w:pStyle w:val="Ttulo3"/>
-        <w:rPr>
-          <w:lang w:val="pt-BR"/>
-        </w:rPr>
-      </w:pPr>
-      <w:r>
-        <w:rPr>
-          <w:lang w:val="pt-BR"/>
-        </w:rPr>
-        <w:t>Registro de Atividades</w:t>
+        <w:pStyle w:val="Numerada"/>
+      </w:pPr>
+      <w:r>
+        <w:t>Execute a ação no HC (transferência, desligamento, novo cadastro).</w:t>
       </w:r>
     </w:p>
     <w:p>
       <w:pPr>
-        <w:rPr>
-          <w:lang w:val="pt-BR"/>
-        </w:rPr>
-      </w:pPr>
-      <w:r>
-        <w:rPr>
-          <w:lang w:val="pt-BR"/>
-        </w:rPr>
-        <w:t>Todo lançamento (adição, edição, edição de status, exclusão, desligamento automático) fica registrado com data/hora, quem operou e uma descrição do que mudou. Filtrável por tipo de movimentação.</w:t>
+        <w:pStyle w:val="Numerada"/>
+      </w:pPr>
+      <w:r>
+        <w:t>Clique em Validar conclusão → o sistema confere automaticamente se a ação foi registrada no histórico.</w:t>
+      </w:r>
+    </w:p>
+    <w:tbl>
+      <w:tblPr>
+        <w:tblW w:type="auto" w:w="0"/>
+        <w:tblLook w:firstColumn="1" w:firstRow="1" w:lastColumn="0" w:lastRow="0" w:noHBand="0" w:noVBand="1" w:val="04A0"/>
+      </w:tblPr>
+      <w:tblGrid>
+        <w:gridCol w:w="9746"/>
+      </w:tblGrid>
+      <w:tr>
+        <w:tc>
+          <w:tcPr>
+            <w:tcW w:type="dxa" w:w="9746"/>
+            <w:tcW w:w="9746" w:type="dxa"/>
+            <w:tcBorders>
+              <w:left w:val="single" w:sz="24" w:space="0" w:color="B02A2A"/>
+            </w:tcBorders>
+            <w:shd w:val="clear" w:color="auto" w:fill="FBE6E6"/>
+          </w:tcPr>
+          <w:p>
+            <w:pPr>
+              <w:spacing w:after="40"/>
+            </w:pPr>
+            <w:r>
+              <w:rPr>
+                <w:b/>
+                <w:color w:val="B02A2A"/>
+                <w:sz w:val="19"/>
+              </w:rPr>
+              <w:t xml:space="preserve">Correção importante: </w:t>
+            </w:r>
+            <w:r>
+              <w:rPr>
+                <w:color w:val="3B4854"/>
+                <w:sz w:val="19"/>
+              </w:rPr>
+              <w:t>um ticket LS sem data de retorno definida (coluna Retorno (LS) exibindo “—”) agora pode ser validado normalmente - quem validar a conclusão preenche a data de retorno no HC antes de confirmar. Antes dessa correção, esses tickets nunca conseguiam ser validados.</w:t>
+            </w:r>
+          </w:p>
+        </w:tc>
+      </w:tr>
+    </w:tbl>
+    <w:p>
+      <w:r>
+        <w:t>Arquivamento (Planning / LC-HARD-EXPERT): um ticket pode ser arquivado (some da lista de abertos, some para o owner) e, se precisar voltar a ficar ativo numa data certa, o Planning pode Programar desarquivamento - escolhe dia e hora, e o próprio sistema reativa o ticket para aquele shift automaticamente, sem precisar lembrar de fazer isso manualmente.</w:t>
       </w:r>
     </w:p>
     <w:p>
       <w:pPr>
-        <w:pStyle w:val="Ttulo3"/>
-        <w:rPr>
-          <w:lang w:val="pt-BR"/>
-        </w:rPr>
-      </w:pPr>
-      <w:r>
-        <w:rPr>
-          <w:lang w:val="pt-BR"/>
-        </w:rPr>
-        <w:t>Histórico Operacional</w:t>
+        <w:pStyle w:val="Ttulo2"/>
+      </w:pPr>
+      <w:r>
+        <w:t>11.3 · Tickets RH — VTO / VTE</w:t>
       </w:r>
     </w:p>
     <w:p>
+      <w:r>
+        <w:t>Solicitações abertas por AA/Associado/PIT via portal externo (tabela portal_ticket_claims):</w:t>
+      </w:r>
+    </w:p>
+    <w:tbl>
+      <w:tblPr>
+        <w:tblStyle w:val="Tabelacomgrade"/>
+        <w:tblW w:type="auto" w:w="0"/>
+        <w:tblLook w:firstColumn="1" w:firstRow="1" w:lastColumn="0" w:lastRow="0" w:noHBand="0" w:noVBand="1" w:val="04A0"/>
+      </w:tblPr>
+      <w:tblGrid>
+        <w:gridCol w:w="3249"/>
+        <w:gridCol w:w="3249"/>
+        <w:gridCol w:w="3249"/>
+      </w:tblGrid>
+      <w:tr>
+        <w:tc>
+          <w:tcPr>
+            <w:tcW w:type="dxa" w:w="3249"/>
+            <w:shd w:val="clear" w:color="auto" w:fill="F4F6F7"/>
+          </w:tcPr>
+          <w:p>
+            <w:r>
+              <w:rPr>
+                <w:b/>
+                <w:sz w:val="18"/>
+              </w:rPr>
+              <w:t>Tipo</w:t>
+            </w:r>
+          </w:p>
+        </w:tc>
+        <w:tc>
+          <w:tcPr>
+            <w:tcW w:type="dxa" w:w="3249"/>
+            <w:shd w:val="clear" w:color="auto" w:fill="F4F6F7"/>
+          </w:tcPr>
+          <w:p>
+            <w:r>
+              <w:rPr>
+                <w:b/>
+                <w:sz w:val="18"/>
+              </w:rPr>
+              <w:t>Descrição</w:t>
+            </w:r>
+          </w:p>
+        </w:tc>
+        <w:tc>
+          <w:tcPr>
+            <w:tcW w:type="dxa" w:w="3249"/>
+            <w:shd w:val="clear" w:color="auto" w:fill="F4F6F7"/>
+          </w:tcPr>
+          <w:p>
+            <w:r>
+              <w:rPr>
+                <w:b/>
+                <w:sz w:val="18"/>
+              </w:rPr>
+              <w:t>Validação para resolver</w:t>
+            </w:r>
+          </w:p>
+        </w:tc>
+      </w:tr>
+      <w:tr>
+        <w:tc>
+          <w:tcPr>
+            <w:tcW w:type="dxa" w:w="3249"/>
+            <w:vAlign w:val="center"/>
+          </w:tcPr>
+          <w:p>
+            <w:r>
+              <w:rPr>
+                <w:sz w:val="19"/>
+              </w:rPr>
+              <w:t>VTO (Voluntary Time Off)</w:t>
+            </w:r>
+          </w:p>
+        </w:tc>
+        <w:tc>
+          <w:tcPr>
+            <w:tcW w:type="dxa" w:w="3249"/>
+            <w:vAlign w:val="center"/>
+          </w:tcPr>
+          <w:p>
+            <w:r>
+              <w:rPr>
+                <w:sz w:val="19"/>
+              </w:rPr>
+              <w:t>Colaborador solicita ausência voluntária.</w:t>
+            </w:r>
+          </w:p>
+        </w:tc>
+        <w:tc>
+          <w:tcPr>
+            <w:tcW w:type="dxa" w:w="3249"/>
+            <w:vAlign w:val="center"/>
+          </w:tcPr>
+          <w:p>
+            <w:r>
+              <w:rPr>
+                <w:sz w:val="19"/>
+              </w:rPr>
+              <w:t>Colaborador deve estar com status Ausência no dia.</w:t>
+            </w:r>
+          </w:p>
+        </w:tc>
+      </w:tr>
+      <w:tr>
+        <w:tc>
+          <w:tcPr>
+            <w:tcW w:type="dxa" w:w="3249"/>
+            <w:vAlign w:val="center"/>
+          </w:tcPr>
+          <w:p>
+            <w:r>
+              <w:rPr>
+                <w:sz w:val="19"/>
+              </w:rPr>
+              <w:t>VTE (Voluntary Time Extension)</w:t>
+            </w:r>
+          </w:p>
+        </w:tc>
+        <w:tc>
+          <w:tcPr>
+            <w:tcW w:type="dxa" w:w="3249"/>
+            <w:vAlign w:val="center"/>
+          </w:tcPr>
+          <w:p>
+            <w:r>
+              <w:rPr>
+                <w:sz w:val="19"/>
+              </w:rPr>
+              <w:t>Colaborador solicita trabalho em outro setor/turno.</w:t>
+            </w:r>
+          </w:p>
+        </w:tc>
+        <w:tc>
+          <w:tcPr>
+            <w:tcW w:type="dxa" w:w="3249"/>
+            <w:vAlign w:val="center"/>
+          </w:tcPr>
+          <w:p>
+            <w:r>
+              <w:rPr>
+                <w:sz w:val="19"/>
+              </w:rPr>
+              <w:t>Aloca o colaborador no setor/turno de destino por 12 horas; depois reverte automaticamente.</w:t>
+            </w:r>
+          </w:p>
+        </w:tc>
+      </w:tr>
+    </w:tbl>
+    <w:p>
+      <w:r>
+        <w:t>Responsável: RME cadastrado na área. Como resolver:</w:t>
+      </w:r>
+    </w:p>
+    <w:p>
+      <w:pPr>
+        <w:pStyle w:val="Numerada"/>
+      </w:pPr>
+      <w:r>
+        <w:t>Clique em Resolver Pendência → vai direto para o Atualizar filtrado pelo login do solicitante.</w:t>
+      </w:r>
+    </w:p>
+    <w:p>
+      <w:pPr>
+        <w:pStyle w:val="Numerada"/>
+      </w:pPr>
+      <w:r>
+        <w:t>Verifique o status do colaborador conforme o tipo de ticket.</w:t>
+      </w:r>
+    </w:p>
+    <w:p>
+      <w:pPr>
+        <w:pStyle w:val="Numerada"/>
+      </w:pPr>
+      <w:r>
+        <w:t>Clique em Validar / Rejeitar → confirme a resolução ou rejeite com observação.</w:t>
+      </w:r>
+    </w:p>
+    <w:tbl>
+      <w:tblPr>
+        <w:tblW w:type="auto" w:w="0"/>
+        <w:tblLook w:firstColumn="1" w:firstRow="1" w:lastColumn="0" w:lastRow="0" w:noHBand="0" w:noVBand="1" w:val="04A0"/>
+      </w:tblPr>
+      <w:tblGrid>
+        <w:gridCol w:w="9746"/>
+      </w:tblGrid>
+      <w:tr>
+        <w:tc>
+          <w:tcPr>
+            <w:tcW w:type="dxa" w:w="9746"/>
+            <w:tcW w:w="9746" w:type="dxa"/>
+            <w:tcBorders>
+              <w:left w:val="single" w:sz="24" w:space="0" w:color="8A5C05"/>
+            </w:tcBorders>
+            <w:shd w:val="clear" w:color="auto" w:fill="F8ECD6"/>
+          </w:tcPr>
+          <w:p>
+            <w:pPr>
+              <w:spacing w:after="40"/>
+            </w:pPr>
+            <w:r>
+              <w:rPr>
+                <w:b/>
+                <w:color w:val="6E4A04"/>
+                <w:sz w:val="19"/>
+              </w:rPr>
+              <w:t xml:space="preserve">VTE: </w:t>
+            </w:r>
+            <w:r>
+              <w:rPr>
+                <w:color w:val="3B4854"/>
+                <w:sz w:val="19"/>
+              </w:rPr>
+              <w:t>ao resolver, o colaborador é automaticamente alocado para o setor/turno de destino. Após 12 horas, o sistema reverte para o setor/turno de origem sem necessidade de ação manual.</w:t>
+            </w:r>
+          </w:p>
+        </w:tc>
+      </w:tr>
+    </w:tbl>
+    <w:p>
+      <w:pPr>
+        <w:spacing w:after="40"/>
+        <w:rPr>
+          <w:lang w:val="pt-BR"/>
+        </w:rPr>
+      </w:pPr>
+    </w:p>
+    <w:p>
+      <w:pPr>
+        <w:pStyle w:val="Ttulo1"/>
+        <w:rPr>
+          <w:lang w:val="pt-BR"/>
+        </w:rPr>
+      </w:pPr>
+      <w:r>
+        <w:rPr>
+          <w:lang w:val="pt-BR"/>
+        </w:rPr>
+        <w:t>12. Histórico</w:t>
+      </w:r>
+    </w:p>
+    <w:p>
+      <w:pPr>
+        <w:rPr>
+          <w:lang w:val="pt-BR"/>
+        </w:rPr>
+      </w:pPr>
+      <w:r>
+        <w:rPr>
+          <w:lang w:val="pt-BR"/>
+        </w:rPr>
+        <w:t>Tela: Histórico · Nível mínimo: EXPERT</w:t>
+      </w:r>
+    </w:p>
+    <w:p>
+      <w:pPr>
+        <w:rPr>
+          <w:lang w:val="pt-BR"/>
+        </w:rPr>
+      </w:pPr>
+      <w:r>
+        <w:rPr>
+          <w:lang w:val="pt-BR"/>
+        </w:rPr>
+        <w:t>Duas abas:</w:t>
+      </w:r>
+    </w:p>
+    <w:p>
+      <w:pPr>
+        <w:pStyle w:val="Ttulo3"/>
+        <w:rPr>
+          <w:lang w:val="pt-BR"/>
+        </w:rPr>
+      </w:pPr>
+      <w:r>
+        <w:rPr>
+          <w:lang w:val="pt-BR"/>
+        </w:rPr>
+        <w:t>Registro de Atividades</w:t>
+      </w:r>
+    </w:p>
+    <w:p>
+      <w:pPr>
+        <w:rPr>
+          <w:lang w:val="pt-BR"/>
+        </w:rPr>
+      </w:pPr>
+      <w:r>
+        <w:rPr>
+          <w:lang w:val="pt-BR"/>
+        </w:rPr>
+        <w:t>Todo lançamento (adição, edição, edição de status, promoção de cargo, agendamento/retorno de LS, transferência entre sites, exclusão, desligamento automático) fica registrado com data/hora, quem operou e uma descrição do que mudou. Filtrável por tipo de movimentação.</w:t>
+      </w:r>
+    </w:p>
+    <w:p>
+      <w:pPr>
+        <w:pStyle w:val="Ttulo3"/>
+        <w:rPr>
+          <w:lang w:val="pt-BR"/>
+        </w:rPr>
+      </w:pPr>
+      <w:r>
+        <w:rPr>
+          <w:lang w:val="pt-BR"/>
+        </w:rPr>
+        <w:t>Histórico Operacional</w:t>
+      </w:r>
+    </w:p>
+    <w:p>
       <w:pPr>
         <w:rPr>
           <w:lang w:val="pt-BR"/>
@@ -3298,6 +4593,19 @@
           <w:lang w:val="pt-BR"/>
         </w:rPr>
         <w:t>Arquivo dos colaboradores desligados — preservado mesmo depois que o cadastro ativo é excluído, com data e motivo do desligamento e quem/quando arquivou.</w:t>
+      </w:r>
+    </w:p>
+    <w:p>
+      <w:pPr>
+        <w:pStyle w:val="Ttulo3"/>
+      </w:pPr>
+      <w:r>
+        <w:t>Filtros avançados e relatório de Due Diligence (DD)</w:t>
+      </w:r>
+    </w:p>
+    <w:p>
+      <w:r>
+        <w:t>Além da busca livre e do filtro por tipo de movimentação, o Registro de Atividades tem um bloco de filtros de relatório (DD): cargo, setor, turno/escala, status e intervalo de datas (de/até). Esses filtros valem pela alocação ATUAL do colaborador, não pela alocação de quando o evento aconteceu. O botão Gerar relatório (Excel) baixa exatamente o recorte filtrado na tela, pronto para uma Due Diligence (DD).</w:t>
       </w:r>
     </w:p>
     <w:p>
@@ -3390,7 +4698,7 @@
         <w:rPr>
           <w:lang w:val="pt-BR"/>
         </w:rPr>
-        <w:t>Defina Acesso ao HC Overview (Permitido/Bloqueado) e, se permitido, o Nível de acesso (LC1/LC3/LC5/EXPERT — seção 4).</w:t>
+        <w:t>Defina Acesso ao HC Overview (Permitido/Bloqueado) e, se permitido, o Nível de acesso (LC1/LC3/LC5/LC-RH-ANALYTICS/EXPERT/LC-HARD-EXPERT - seção 4).</w:t>
       </w:r>
     </w:p>
     <w:p>
@@ -3710,6 +5018,107 @@
           <w:lang w:val="pt-BR"/>
         </w:rPr>
         <w:t>Para ajustar, altere o horário no campo do turno desejado e clique em Salvar horários.</w:t>
+      </w:r>
+    </w:p>
+    <w:p>
+      <w:pPr>
+        <w:pStyle w:val="Ttulo2"/>
+      </w:pPr>
+      <w:r>
+        <w:t>13.3 · Aplicações integradas e controle central de acesso</w:t>
+      </w:r>
+    </w:p>
+    <w:p>
+      <w:r>
+        <w:t>A HC Overview pode atuar como autoridade central de acesso para outras aplicações integradas (ex.: Maestro, LaborDash, DockView): cada aplicação consulta a HC Overview, a cada requisição, se um usuário pode acessá-la e com qual perfil - revogação e bloqueio valem na próxima chamada, sem cache.</w:t>
+      </w:r>
+    </w:p>
+    <w:p>
+      <w:r>
+        <w:t>Card Aplicações integradas: cadastra a aplicação externa (nome, identificador/slug, perfis sugeridos) e gera/revoga a credencial técnica (chave) daquela aplicação - uma credencial autentica a APLICAÇÃO, nunca um usuário.</w:t>
+      </w:r>
+    </w:p>
+    <w:p>
+      <w:r>
+        <w:t>Botão Integrações, na linha de cada operador, abre:</w:t>
+      </w:r>
+    </w:p>
+    <w:p>
+      <w:pPr>
+        <w:pStyle w:val="Commarcadores"/>
+      </w:pPr>
+      <w:r>
+        <w:t>Tabela Aplicação | Acesso liberado | Perfil | Permissões | Expiração | Status | Ações - libera, atualiza ou revoga o acesso do operador em cada aplicação integrada.</w:t>
+      </w:r>
+    </w:p>
+    <w:p>
+      <w:pPr>
+        <w:pStyle w:val="Commarcadores"/>
+      </w:pPr>
+      <w:r>
+        <w:t>Bloqueio global - corta o acesso do operador a TODAS as aplicações integradas (inclusive à própria HC Overview) imediatamente, mesmo com sessão ainda ativa.</w:t>
+      </w:r>
+    </w:p>
+    <w:p>
+      <w:pPr>
+        <w:pStyle w:val="Commarcadores"/>
+      </w:pPr>
+      <w:r>
+        <w:t>Auth — chaves de segurança (YubiKey) - cadastra a chave física já existente do usuário: toca a chave no campo (ou cola os 12 primeiros caracteres do código dela) e salva. Não gera chave nova - só registra a que a pessoa já possui.</w:t>
+      </w:r>
+    </w:p>
+    <w:p>
+      <w:pPr>
+        <w:pStyle w:val="Commarcadores"/>
+      </w:pPr>
+      <w:r>
+        <w:t>Histórico de auditoria do usuário - quem liberou, revogou ou bloqueou, quando e em qual aplicação.</w:t>
+      </w:r>
+    </w:p>
+    <w:tbl>
+      <w:tblPr>
+        <w:tblW w:type="auto" w:w="0"/>
+        <w:tblLook w:firstColumn="1" w:firstRow="1" w:lastColumn="0" w:lastRow="0" w:noHBand="0" w:noVBand="1" w:val="04A0"/>
+      </w:tblPr>
+      <w:tblGrid>
+        <w:gridCol w:w="9746"/>
+      </w:tblGrid>
+      <w:tr>
+        <w:tc>
+          <w:tcPr>
+            <w:tcW w:type="dxa" w:w="9746"/>
+            <w:tcW w:w="9746" w:type="dxa"/>
+            <w:tcBorders>
+              <w:left w:val="single" w:sz="24" w:space="0" w:color="B02A2A"/>
+            </w:tcBorders>
+            <w:shd w:val="clear" w:color="auto" w:fill="FBE6E6"/>
+          </w:tcPr>
+          <w:p>
+            <w:pPr>
+              <w:spacing w:after="40"/>
+            </w:pPr>
+            <w:r>
+              <w:rPr>
+                <w:b/>
+                <w:color w:val="B02A2A"/>
+                <w:sz w:val="19"/>
+              </w:rPr>
+              <w:t xml:space="preserve">Importante sobre a chave de segurança: </w:t>
+            </w:r>
+            <w:r>
+              <w:rPr>
+                <w:color w:val="3B4854"/>
+                <w:sz w:val="19"/>
+              </w:rPr>
+              <w:t>só o ID público (os 12 primeiros caracteres) é conferido - a parte variável do código, que muda a cada toque na chave, não é validada nesta versão. Trate esse ID como informação sensível (evite expor na tela ou repassar por mensagem): quem o conhecer consegue se identificar como o dono da chave até ela ser revogada.</w:t>
+            </w:r>
+          </w:p>
+        </w:tc>
+      </w:tr>
+    </w:tbl>
+    <w:p>
+      <w:r>
+        <w:t>Essa mesma chave de segurança também permite entrar na própria HC Overview sem digitar o login (seção 5), e pode ser usada por outras aplicações integradas para identificar o usuário antes de checar a autorização central.</w:t>
       </w:r>
     </w:p>
     <w:p>
@@ -3823,6 +5232,59 @@
               <w:rPr>
                 <w:sz w:val="19"/>
               </w:rPr>
+              <w:t>Ausência</w:t>
+            </w:r>
+          </w:p>
+        </w:tc>
+        <w:tc>
+          <w:tcPr>
+            <w:tcW w:w="3249" w:type="dxa"/>
+            <w:vAlign w:val="center"/>
+          </w:tcPr>
+          <w:p>
+            <w:pPr>
+              <w:spacing w:after="0"/>
+            </w:pPr>
+            <w:r>
+              <w:rPr>
+                <w:sz w:val="19"/>
+              </w:rPr>
+              <w:t>Próxima troca de turno (Configuração de Shifts)</w:t>
+            </w:r>
+          </w:p>
+        </w:tc>
+        <w:tc>
+          <w:tcPr>
+            <w:tcW w:w="3249" w:type="dxa"/>
+            <w:vAlign w:val="center"/>
+          </w:tcPr>
+          <w:p>
+            <w:pPr>
+              <w:spacing w:after="0"/>
+            </w:pPr>
+            <w:r>
+              <w:rPr>
+                <w:sz w:val="19"/>
+              </w:rPr>
+              <w:t>OPERACIONAL - não espera o dia seguinte</w:t>
+            </w:r>
+          </w:p>
+        </w:tc>
+      </w:tr>
+      <w:tr>
+        <w:tc>
+          <w:tcPr>
+            <w:tcW w:w="3249" w:type="dxa"/>
+            <w:vAlign w:val="center"/>
+          </w:tcPr>
+          <w:p>
+            <w:pPr>
+              <w:spacing w:after="0"/>
+            </w:pPr>
+            <w:r>
+              <w:rPr>
+                <w:sz w:val="19"/>
+              </w:rPr>
               <w:t>Treinamento (AA/Associado)</w:t>
             </w:r>
           </w:p>
@@ -4094,6 +5556,165 @@
                 <w:sz w:val="19"/>
               </w:rPr>
               <w:t>Arquivado no Histórico Operacional</w:t>
+            </w:r>
+          </w:p>
+        </w:tc>
+      </w:tr>
+      <w:tr>
+        <w:tc>
+          <w:tcPr>
+            <w:tcW w:w="3249" w:type="dxa"/>
+            <w:vAlign w:val="center"/>
+          </w:tcPr>
+          <w:p>
+            <w:pPr>
+              <w:spacing w:after="0"/>
+            </w:pPr>
+            <w:r>
+              <w:rPr>
+                <w:sz w:val="19"/>
+              </w:rPr>
+              <w:t>LS (Labor Share)</w:t>
+            </w:r>
+          </w:p>
+        </w:tc>
+        <w:tc>
+          <w:tcPr>
+            <w:tcW w:w="3249" w:type="dxa"/>
+            <w:vAlign w:val="center"/>
+          </w:tcPr>
+          <w:p>
+            <w:pPr>
+              <w:spacing w:after="0"/>
+            </w:pPr>
+            <w:r>
+              <w:rPr>
+                <w:sz w:val="19"/>
+              </w:rPr>
+              <w:t>Data/hora de retorno atingida, alinhada à próxima troca de turno do shift de destino</w:t>
+            </w:r>
+          </w:p>
+        </w:tc>
+        <w:tc>
+          <w:tcPr>
+            <w:tcW w:w="3249" w:type="dxa"/>
+            <w:vAlign w:val="center"/>
+          </w:tcPr>
+          <w:p>
+            <w:pPr>
+              <w:spacing w:after="0"/>
+            </w:pPr>
+            <w:r>
+              <w:rPr>
+                <w:sz w:val="19"/>
+              </w:rPr>
+              <w:t>OPERACIONAL no setor/escala de origem (ou no site de origem, se o empréstimo foi cruzado entre CNF2 e IXD-CNF2)</w:t>
+            </w:r>
+          </w:p>
+        </w:tc>
+      </w:tr>
+      <w:tr>
+        <w:tc>
+          <w:tcPr>
+            <w:tcW w:w="3249" w:type="dxa"/>
+            <w:vAlign w:val="center"/>
+          </w:tcPr>
+          <w:p>
+            <w:pPr>
+              <w:spacing w:after="0"/>
+            </w:pPr>
+            <w:r>
+              <w:rPr>
+                <w:sz w:val="19"/>
+              </w:rPr>
+              <w:t>VTE</w:t>
+            </w:r>
+          </w:p>
+        </w:tc>
+        <w:tc>
+          <w:tcPr>
+            <w:tcW w:w="3249" w:type="dxa"/>
+            <w:vAlign w:val="center"/>
+          </w:tcPr>
+          <w:p>
+            <w:pPr>
+              <w:spacing w:after="0"/>
+            </w:pPr>
+            <w:r>
+              <w:rPr>
+                <w:sz w:val="19"/>
+              </w:rPr>
+              <w:t>12 horas após a resolução do ticket RH</w:t>
+            </w:r>
+          </w:p>
+        </w:tc>
+        <w:tc>
+          <w:tcPr>
+            <w:tcW w:w="3249" w:type="dxa"/>
+            <w:vAlign w:val="center"/>
+          </w:tcPr>
+          <w:p>
+            <w:pPr>
+              <w:spacing w:after="0"/>
+            </w:pPr>
+            <w:r>
+              <w:rPr>
+                <w:sz w:val="19"/>
+              </w:rPr>
+              <w:t>Retorna ao setor/turno de origem, status OPERACIONAL</w:t>
+            </w:r>
+          </w:p>
+        </w:tc>
+      </w:tr>
+      <w:tr>
+        <w:tc>
+          <w:tcPr>
+            <w:tcW w:w="3249" w:type="dxa"/>
+            <w:vAlign w:val="center"/>
+          </w:tcPr>
+          <w:p>
+            <w:pPr>
+              <w:spacing w:after="0"/>
+            </w:pPr>
+            <w:r>
+              <w:rPr>
+                <w:sz w:val="19"/>
+              </w:rPr>
+              <w:t>Ticket de premissa arquivado com desarquivamento programado</w:t>
+            </w:r>
+          </w:p>
+        </w:tc>
+        <w:tc>
+          <w:tcPr>
+            <w:tcW w:w="3249" w:type="dxa"/>
+            <w:vAlign w:val="center"/>
+          </w:tcPr>
+          <w:p>
+            <w:pPr>
+              <w:spacing w:after="0"/>
+            </w:pPr>
+            <w:r>
+              <w:rPr>
+                <w:sz w:val="19"/>
+              </w:rPr>
+              <w:t>Data/hora definida pelo Planning atingida</w:t>
+            </w:r>
+          </w:p>
+        </w:tc>
+        <w:tc>
+          <w:tcPr>
+            <w:tcW w:w="3249" w:type="dxa"/>
+            <w:vAlign w:val="center"/>
+          </w:tcPr>
+          <w:p>
+            <w:pPr>
+              <w:spacing w:after="0"/>
+            </w:pPr>
+            <w:r>
+              <w:rPr>
+                <w:sz w:val="19"/>
+              </w:rPr>
+              <w:t>Ticket volta a ficar ativo para o shift automaticamente</w:t>
             </w:r>
           </w:p>
         </w:tc>
@@ -4415,6 +6036,71 @@
           </w:p>
         </w:tc>
       </w:tr>
+      <w:tr>
+        <w:tc>
+          <w:tcPr>
+            <w:tcW w:w="3249" w:type="dxa"/>
+            <w:vAlign w:val="center"/>
+          </w:tcPr>
+          <w:p>
+            <w:pPr>
+              <w:spacing w:after="0"/>
+            </w:pPr>
+            <w:r>
+              <w:rPr>
+                <w:rFonts w:ascii="Consolas" w:hAnsi="Consolas"/>
+                <w:sz w:val="19"/>
+              </w:rPr>
+              <w:t>01</w:t>
+            </w:r>
+          </w:p>
+        </w:tc>
+        <w:tc>
+          <w:tcPr>
+            <w:tcW w:w="3249" w:type="dxa"/>
+            <w:vAlign w:val="center"/>
+          </w:tcPr>
+          <w:p>
+            <w:pPr>
+              <w:spacing w:after="0"/>
+            </w:pPr>
+            <w:r>
+              <w:rPr>
+                <w:rFonts w:ascii="Consolas" w:hAnsi="Consolas"/>
+                <w:sz w:val="19"/>
+              </w:rPr>
+              <w:t>14/10/2026</w:t>
+            </w:r>
+          </w:p>
+        </w:tc>
+        <w:tc>
+          <w:tcPr>
+            <w:tcW w:w="3249" w:type="dxa"/>
+            <w:vAlign w:val="center"/>
+          </w:tcPr>
+          <w:p>
+            <w:pPr>
+              <w:spacing w:after="0"/>
+              <w:rPr>
+                <w:lang w:val="pt-BR"/>
+              </w:rPr>
+            </w:pPr>
+            <w:proofErr w:type="spellStart"/>
+            <w:proofErr w:type="spellEnd"/>
+            <w:proofErr w:type="spellStart"/>
+            <w:proofErr w:type="spellEnd"/>
+            <w:proofErr w:type="spellStart"/>
+            <w:proofErr w:type="spellEnd"/>
+            <w:r>
+              <w:rPr>
+                <w:sz w:val="19"/>
+                <w:lang w:val="pt-BR"/>
+              </w:rPr>
+              <w:t>Inclui: cargo PIT Trainee; status Ausência retorna na próxima troca de turno (mesma lógica da chamada); LS com retorno alinhado à próxima troca de turno, incluindo empréstimo/transferência definitiva entre CNF2 e IXD-CNF2; níveis de acesso LC-RH-ANALYTICS e LC-HARD-EXPERT; tickets de premissas (LS/LT/TOFF/RP/ON) e tickets RH (VTO/VTE) em Pendências, incluindo correção de validação de LS sem data de retorno e agendamento de desarquivamento automático; filtros avançados e relatório de Due Diligence (DD) e tipo Promoção em Histórico; campo Agência no cadastro/LIST/Dashboard; Aplicações integradas e controle central de acesso (inclusive autenticação por chave de segurança/YubiKey) na tela Usuários; sessão de login persistente.</w:t>
+            </w:r>
+          </w:p>
+        </w:tc>
+      </w:tr>
     </w:tbl>
     <w:p>
       <w:pPr>
@@ -4588,7 +6274,7 @@
           <w:sz w:val="16"/>
           <w:lang w:val="pt-BR"/>
         </w:rPr>
-        <w:t>IT-HCOV-001 · Rev. 00 · Sistema HC Overview — documento de uso interno.</w:t>
+        <w:t>IT-HCOV-001 · Rev. 01 · Sistema HC Overview — documento de uso interno.</w:t>
       </w:r>
     </w:p>
     <w:sectPr>

</xml_diff>